<commit_message>
add Capacity & SLO estimation
</commit_message>
<xml_diff>
--- a/docs/FeatureManagementService_design.docx
+++ b/docs/FeatureManagementService_design.docx
@@ -2047,6 +2047,153 @@
       <w:pPr>
         <w:rPr>
           <w:rFonts w:hint="eastAsia"/>
+        </w:rPr>
+      </w:pPr>
+    </w:p>
+    <w:p>
+      <w:pPr>
+        <w:rPr>
+          <w:rFonts w:hint="eastAsia"/>
+        </w:rPr>
+      </w:pPr>
+      <w:r>
+        <w:t>SDK by client type:</w:t>
+      </w:r>
+    </w:p>
+    <w:p>
+      <w:pPr>
+        <w:rPr>
+          <w:rFonts w:hint="eastAsia"/>
+        </w:rPr>
+      </w:pPr>
+      <w:r>
+        <w:t>Web / Backend:</w:t>
+      </w:r>
+    </w:p>
+    <w:p>
+      <w:pPr>
+        <w:pStyle w:val="a9"/>
+        <w:rPr>
+          <w:rFonts w:hint="eastAsia"/>
+        </w:rPr>
+      </w:pPr>
+      <w:r>
+        <w:t>Local mem cache + push + poll 60s</w:t>
+      </w:r>
+    </w:p>
+    <w:p>
+      <w:pPr>
+        <w:pStyle w:val="a9"/>
+        <w:rPr>
+          <w:rFonts w:hint="eastAsia"/>
+        </w:rPr>
+      </w:pPr>
+      <w:r>
+        <w:t>isEnabled called from request path, target &lt; 50us p99</w:t>
+      </w:r>
+    </w:p>
+    <w:p>
+      <w:pPr>
+        <w:pStyle w:val="a9"/>
+        <w:rPr>
+          <w:rFonts w:hint="eastAsia"/>
+        </w:rPr>
+      </w:pPr>
+      <w:r>
+        <w:t>Cold start: load snapshot once on process init</w:t>
+      </w:r>
+    </w:p>
+    <w:p>
+      <w:pPr>
+        <w:pStyle w:val="a9"/>
+        <w:rPr>
+          <w:rFonts w:hint="eastAsia"/>
+        </w:rPr>
+      </w:pPr>
+      <w:r>
+        <w:t>Polling backstop in case Pub/Sub missed events</w:t>
+      </w:r>
+    </w:p>
+    <w:p>
+      <w:pPr>
+        <w:rPr>
+          <w:rFonts w:hint="eastAsia"/>
+        </w:rPr>
+      </w:pPr>
+      <w:r>
+        <w:t>Mobile (iOS / Android):</w:t>
+      </w:r>
+    </w:p>
+    <w:p>
+      <w:pPr>
+        <w:pStyle w:val="a9"/>
+        <w:rPr>
+          <w:rFonts w:hint="eastAsia"/>
+        </w:rPr>
+      </w:pPr>
+      <w:r>
+        <w:lastRenderedPageBreak/>
+        <w:t>Local mem cache + push only (no poll, save battery + data)</w:t>
+      </w:r>
+    </w:p>
+    <w:p>
+      <w:pPr>
+        <w:pStyle w:val="a9"/>
+        <w:rPr>
+          <w:rFonts w:hint="eastAsia"/>
+        </w:rPr>
+      </w:pPr>
+      <w:r>
+        <w:t>Cache size cap ~ 500KB</w:t>
+      </w:r>
+    </w:p>
+    <w:p>
+      <w:pPr>
+        <w:pStyle w:val="a9"/>
+        <w:rPr>
+          <w:rFonts w:hint="eastAsia"/>
+        </w:rPr>
+      </w:pPr>
+      <w:r>
+        <w:t>Push via APNs / FCM when app in background, Redis Pub/Sub when in foreground</w:t>
+      </w:r>
+    </w:p>
+    <w:p>
+      <w:pPr>
+        <w:pStyle w:val="a9"/>
+        <w:rPr>
+          <w:rFonts w:hint="eastAsia"/>
+        </w:rPr>
+      </w:pPr>
+      <w:r>
+        <w:t>Network often offline → SDK must keep working with last cached snapshot</w:t>
+      </w:r>
+    </w:p>
+    <w:p>
+      <w:pPr>
+        <w:pStyle w:val="a9"/>
+        <w:rPr>
+          <w:rFonts w:hint="eastAsia"/>
+        </w:rPr>
+      </w:pPr>
+      <w:r>
+        <w:t>isEnabled called less often (every screen load), still target &lt; 1ms local</w:t>
+      </w:r>
+    </w:p>
+    <w:p>
+      <w:pPr>
+        <w:rPr>
+          <w:rFonts w:hint="eastAsia"/>
+        </w:rPr>
+      </w:pPr>
+      <w:r>
+        <w:t>Same eval logic on both, same flag schema. Transport and cache config differ.</w:t>
+      </w:r>
+    </w:p>
+    <w:p>
+      <w:pPr>
+        <w:rPr>
+          <w:rFonts w:hint="eastAsia"/>
           <w:b/>
           <w:bCs/>
         </w:rPr>
@@ -2486,7 +2633,6 @@
                 <w:b/>
                 <w:bCs/>
               </w:rPr>
-              <w:lastRenderedPageBreak/>
               <w:t>POST   /api/v1/flags/{key}/targeting</w:t>
             </w:r>
           </w:p>
@@ -3238,6 +3384,7 @@
                 <w:b/>
                 <w:bCs/>
               </w:rPr>
+              <w:lastRenderedPageBreak/>
               <w:t>M</w:t>
             </w:r>
             <w:r>
@@ -3804,7 +3951,6 @@
           <w:b/>
           <w:bCs/>
         </w:rPr>
-        <w:lastRenderedPageBreak/>
         <w:t>Management API</w:t>
       </w:r>
     </w:p>
@@ -4440,6 +4586,7 @@
     <w:p>
       <w:pPr>
         <w:rPr>
+          <w:rFonts w:hint="eastAsia"/>
           <w:b/>
           <w:bCs/>
         </w:rPr>
@@ -4515,7 +4662,14 @@
         <w:rPr>
           <w:rFonts w:hint="eastAsia"/>
         </w:rPr>
-        <w:t xml:space="preserve"> with the user info</w:t>
+        <w:t xml:space="preserve"> with the user </w:t>
+      </w:r>
+      <w:r>
+        <w:rPr>
+          <w:rFonts w:hint="eastAsia"/>
+        </w:rPr>
+        <w:lastRenderedPageBreak/>
+        <w:t>info</w:t>
       </w:r>
       <w:r>
         <w:rPr>
@@ -4558,6 +4712,7 @@
     <w:p>
       <w:pPr>
         <w:rPr>
+          <w:rFonts w:hint="eastAsia"/>
           <w:b/>
           <w:bCs/>
         </w:rPr>
@@ -5279,9 +5434,8 @@
           <w:b/>
           <w:bCs/>
         </w:rPr>
-        <w:t xml:space="preserve">  "</w:t>
-      </w:r>
-      <w:proofErr w:type="spellStart"/>
+        <w:t>"</w:t>
+      </w:r>
       <w:proofErr w:type="gramStart"/>
       <w:r>
         <w:rPr>
@@ -5298,16 +5452,7 @@
           <w:b/>
           <w:bCs/>
         </w:rPr>
-        <w:t>_context</w:t>
-      </w:r>
-      <w:proofErr w:type="spellEnd"/>
-      <w:r>
-        <w:rPr>
-          <w:rFonts w:hint="eastAsia"/>
-          <w:b/>
-          <w:bCs/>
-        </w:rPr>
-        <w:t xml:space="preserve">": </w:t>
+        <w:t xml:space="preserve">_context": </w:t>
       </w:r>
       <w:proofErr w:type="gramStart"/>
       <w:r>
@@ -5325,7 +5470,7 @@
           <w:b/>
           <w:bCs/>
         </w:rPr>
-        <w:t>region": "us-west-2", "tenant": "enterprise</w:t>
+        <w:t>region": "us-west-2", "tenant": "enterprise", "role": "vip</w:t>
       </w:r>
       <w:proofErr w:type="gramStart"/>
       <w:r>
@@ -5343,23 +5488,37 @@
           <w:b/>
           <w:bCs/>
         </w:rPr>
-        <w:t xml:space="preserve">   </w:t>
-      </w:r>
-      <w:r>
-        <w:rPr>
-          <w:rFonts w:hint="eastAsia"/>
-          <w:b/>
-          <w:bCs/>
-        </w:rPr>
-        <w:t>//</w:t>
-      </w:r>
-      <w:r>
-        <w:rPr>
-          <w:rFonts w:hint="eastAsia"/>
-          <w:b/>
-          <w:bCs/>
-        </w:rPr>
-        <w:t xml:space="preserve"> U123's profile at that time</w:t>
+        <w:t>,   // U123 profile at that time</w:t>
+      </w:r>
+    </w:p>
+    <w:p>
+      <w:pPr>
+        <w:rPr>
+          <w:rFonts w:hint="eastAsia"/>
+        </w:rPr>
+      </w:pPr>
+      <w:r>
+        <w:t>"release": "checkout-v2.3",   // which release/train this flag belongs to</w:t>
+      </w:r>
+    </w:p>
+    <w:p>
+      <w:pPr>
+        <w:rPr>
+          <w:rFonts w:hint="eastAsia"/>
+        </w:rPr>
+      </w:pPr>
+      <w:r>
+        <w:t>"evaluated_at": "2026-06-24T14:00:00Z",   // when the flag was evaluated</w:t>
+      </w:r>
+    </w:p>
+    <w:p>
+      <w:pPr>
+        <w:rPr>
+          <w:rFonts w:hint="eastAsia"/>
+        </w:rPr>
+      </w:pPr>
+      <w:r>
+        <w:t>"rule_path": ["region=us-west-2", "role=vip", "pct=10%"]   // rules matched, in order</w:t>
       </w:r>
     </w:p>
     <w:p>
@@ -5378,6 +5537,282 @@
         </w:rPr>
         <w:t>}</w:t>
       </w:r>
+    </w:p>
+    <w:p>
+      <w:pPr>
+        <w:rPr>
+          <w:rFonts w:hint="eastAsia"/>
+        </w:rPr>
+      </w:pPr>
+    </w:p>
+    <w:p>
+      <w:pPr>
+        <w:rPr>
+          <w:rFonts w:hint="eastAsia"/>
+          <w:b/>
+          <w:bCs/>
+        </w:rPr>
+      </w:pPr>
+      <w:r>
+        <w:rPr>
+          <w:b/>
+          <w:bCs/>
+        </w:rPr>
+        <w:t>8. Capacity &amp; SLO</w:t>
+      </w:r>
+      <w:r>
+        <w:rPr>
+          <w:rFonts w:hint="eastAsia"/>
+          <w:b/>
+          <w:bCs/>
+        </w:rPr>
+        <w:t xml:space="preserve"> </w:t>
+      </w:r>
+      <w:r>
+        <w:rPr>
+          <w:b/>
+          <w:bCs/>
+        </w:rPr>
+        <w:t>estimation</w:t>
+      </w:r>
+    </w:p>
+    <w:p>
+      <w:pPr>
+        <w:rPr>
+          <w:rFonts w:hint="eastAsia"/>
+        </w:rPr>
+      </w:pPr>
+      <w:r>
+        <w:rPr>
+          <w:rFonts w:hint="eastAsia"/>
+        </w:rPr>
+        <w:t>Capacity</w:t>
+      </w:r>
+      <w:r>
+        <w:t>:</w:t>
+      </w:r>
+    </w:p>
+    <w:p>
+      <w:pPr>
+        <w:pStyle w:val="a9"/>
+        <w:rPr>
+          <w:rFonts w:hint="eastAsia"/>
+        </w:rPr>
+      </w:pPr>
+      <w:r>
+        <w:t>Applications: 200 (env × app)</w:t>
+      </w:r>
+    </w:p>
+    <w:p>
+      <w:pPr>
+        <w:pStyle w:val="a9"/>
+        <w:rPr>
+          <w:rFonts w:hint="eastAsia"/>
+        </w:rPr>
+      </w:pPr>
+      <w:r>
+        <w:t>Flags per app: avg 80, max 300</w:t>
+      </w:r>
+    </w:p>
+    <w:p>
+      <w:pPr>
+        <w:pStyle w:val="a9"/>
+        <w:rPr>
+          <w:rFonts w:hint="eastAsia"/>
+        </w:rPr>
+      </w:pPr>
+      <w:r>
+        <w:t>Total flag rows in PG: ~ 60K</w:t>
+      </w:r>
+    </w:p>
+    <w:p>
+      <w:pPr>
+        <w:pStyle w:val="a9"/>
+        <w:rPr>
+          <w:rFonts w:hint="eastAsia"/>
+        </w:rPr>
+      </w:pPr>
+      <w:r>
+        <w:t>SDK instances: ~</w:t>
+      </w:r>
+      <w:r>
+        <w:rPr>
+          <w:rFonts w:hint="eastAsia"/>
+        </w:rPr>
+        <w:t>5</w:t>
+      </w:r>
+      <w:r>
+        <w:t>K processes (web + backend)</w:t>
+      </w:r>
+    </w:p>
+    <w:p>
+      <w:pPr>
+        <w:pStyle w:val="a9"/>
+        <w:rPr>
+          <w:rFonts w:hint="eastAsia"/>
+        </w:rPr>
+      </w:pPr>
+      <w:r>
+        <w:rPr>
+          <w:rFonts w:hint="eastAsia"/>
+        </w:rPr>
+        <w:t>management</w:t>
+      </w:r>
+      <w:r>
+        <w:t xml:space="preserve"> API QPS: 50</w:t>
+      </w:r>
+      <w:r>
+        <w:rPr>
+          <w:rFonts w:hint="eastAsia"/>
+        </w:rPr>
+        <w:t>/s</w:t>
+      </w:r>
+      <w:r>
+        <w:t xml:space="preserve"> avg, 200</w:t>
+      </w:r>
+      <w:r>
+        <w:rPr>
+          <w:rFonts w:hint="eastAsia"/>
+        </w:rPr>
+        <w:t>/s</w:t>
+      </w:r>
+      <w:r>
+        <w:t xml:space="preserve"> peak</w:t>
+      </w:r>
+    </w:p>
+    <w:p>
+      <w:pPr>
+        <w:pStyle w:val="a9"/>
+        <w:rPr>
+          <w:rFonts w:hint="eastAsia"/>
+        </w:rPr>
+      </w:pPr>
+      <w:r>
+        <w:t xml:space="preserve">snapshot API QPS: </w:t>
+      </w:r>
+      <w:r>
+        <w:t>~85/s</w:t>
+      </w:r>
+      <w:r>
+        <w:t xml:space="preserve"> (</w:t>
+      </w:r>
+      <w:r>
+        <w:t>5K SDK × poll 60s</w:t>
+      </w:r>
+      <w:r>
+        <w:t>)</w:t>
+      </w:r>
+    </w:p>
+    <w:p>
+      <w:pPr>
+        <w:pStyle w:val="a9"/>
+        <w:rPr>
+          <w:rFonts w:hint="eastAsia"/>
+        </w:rPr>
+      </w:pPr>
+      <w:r>
+        <w:t xml:space="preserve">Pub/Sub msg/s: ~ </w:t>
+      </w:r>
+      <w:r>
+        <w:rPr>
+          <w:rFonts w:hint="eastAsia"/>
+        </w:rPr>
+        <w:t>5</w:t>
+      </w:r>
+      <w:r>
+        <w:t>K per flag change</w:t>
+      </w:r>
+    </w:p>
+    <w:p>
+      <w:pPr>
+        <w:pStyle w:val="a9"/>
+        <w:rPr>
+          <w:rFonts w:hint="eastAsia"/>
+        </w:rPr>
+      </w:pPr>
+      <w:r>
+        <w:t>Snapshot size per app: ≤ 200KB raw</w:t>
+      </w:r>
+    </w:p>
+    <w:p>
+      <w:pPr>
+        <w:rPr>
+          <w:rFonts w:hint="eastAsia"/>
+        </w:rPr>
+      </w:pPr>
+      <w:r>
+        <w:t>Availability:</w:t>
+      </w:r>
+    </w:p>
+    <w:p>
+      <w:pPr>
+        <w:pStyle w:val="a9"/>
+        <w:rPr>
+          <w:rFonts w:hint="eastAsia"/>
+        </w:rPr>
+      </w:pPr>
+      <w:r>
+        <w:rPr>
+          <w:rFonts w:hint="eastAsia"/>
+        </w:rPr>
+        <w:t>S</w:t>
+      </w:r>
+      <w:r>
+        <w:t>napshot</w:t>
+      </w:r>
+      <w:r>
+        <w:rPr>
+          <w:rFonts w:hint="eastAsia"/>
+        </w:rPr>
+        <w:t xml:space="preserve"> API</w:t>
+      </w:r>
+      <w:r>
+        <w:t>: 99.95%</w:t>
+      </w:r>
+    </w:p>
+    <w:p>
+      <w:pPr>
+        <w:pStyle w:val="a9"/>
+        <w:rPr>
+          <w:rFonts w:hint="eastAsia"/>
+        </w:rPr>
+      </w:pPr>
+      <w:r>
+        <w:rPr>
+          <w:rFonts w:hint="eastAsia"/>
+        </w:rPr>
+        <w:t>management</w:t>
+      </w:r>
+      <w:r>
+        <w:t xml:space="preserve"> </w:t>
+      </w:r>
+      <w:r>
+        <w:rPr>
+          <w:rFonts w:hint="eastAsia"/>
+        </w:rPr>
+        <w:t>API</w:t>
+      </w:r>
+      <w:r>
+        <w:t>: 99.9%</w:t>
+      </w:r>
+    </w:p>
+    <w:p>
+      <w:pPr>
+        <w:pStyle w:val="a9"/>
+        <w:rPr>
+          <w:rFonts w:hint="eastAsia"/>
+        </w:rPr>
+      </w:pPr>
+      <w:r>
+        <w:t>SDK offline: 100%</w:t>
+      </w:r>
+    </w:p>
+    <w:p>
+      <w:pPr>
+        <w:rPr>
+          <w:rFonts w:hint="eastAsia"/>
+        </w:rPr>
+      </w:pPr>
     </w:p>
     <w:sectPr>
       <w:pgSz w:w="11906" w:h="16838"/>

</xml_diff>